<commit_message>
Add BiLSTM multi-seed results and completed final report
</commit_message>
<xml_diff>
--- a/docs/ICT4442_PartC_Final_HAR.docx
+++ b/docs/ICT4442_PartC_Final_HAR.docx
@@ -333,7 +333,7 @@
           <w:sz w:val="20"/>
           <w:szCs w:val="20"/>
         </w:rPr>
-        <w:t xml:space="preserve"> - Human Activity Recognition (HAR) from body-worn inertial sensors is usually approached by choosing a deep architecture and reporting its accuracy, which leaves open how much of that accuracy the architecture is responsible for. This project treats the question directly. Three models drawn from different families, a Multi-Layer Perceptron, a one-dimensional Convolutional Neural Network and a Bidirectional LSTM, are trained on byte-identical 128 x 9 windows of raw tri-axial accelerometer and gyroscope signals from the UCI HAR dataset, under one optimiser, one early-stopping criterion and one metric set, so that architecture is the only variable that differs. A strictly subject-independent protocol is enforced and verified empirically, because the dataset’s 50% window overlap makes a random split leak near-duplicate windows across partitions. Each model is run at five seeds rather than once. The convolutional model reaches 0.9211 ± 0.0065 test accuracy against 0.8925 ± 0.0087 for the fully connected baseline, a separation well outside seed variation, while using 2.6 times fewer parameters. An ablation shows the baseline is not capacity-limited, so that gap is attributable to inductive bias rather than model size. A secondary study trains the same baseline architecture on the dataset’s 561 hand-crafted features and reaches 0.9170 ± 0.0067, statistically indistinguishable from the convolutional model: the architectural prior is not the only route to this level of performance, but it is the one that needs no expert feature design. Across every model the dominant error is the sitting/standing boundary, which a waist-mounted sensor cannot resolve because both postures present a near-identical gravity vector.</w:t>
+        <w:t xml:space="preserve"> - Human Activity Recognition (HAR) from body-worn inertial sensors is usually approached by choosing a deep architecture and reporting its accuracy, which leaves open how much of that accuracy the architecture is responsible for. This project treats the question directly. Three models drawn from different families, a Multi-Layer Perceptron, a one-dimensional Convolutional Neural Network and a Bidirectional LSTM, are trained on byte-identical 128 x 9 windows of raw tri-axial accelerometer and gyroscope signals from the UCI HAR dataset, under one optimiser, one early-stopping criterion and one metric set, so that architecture is the only variable that differs. A strictly subject-independent protocol is enforced and verified empirically, because the dataset’s 50% window overlap makes a random split leak near-duplicate windows across partitions. Each model is run at five seeds rather than once. The convolutional model reaches 0.9211 ± 0.0065 test accuracy against 0.8925 ± 0.0087 for the fully connected baseline, a separation well outside seed variation, while using 2.6 times fewer parameters. The bidirectional recurrent model reaches 0.8921 ± 0.0103, indistinguishable from the baseline on a comparable parameter budget, so the strongest structural assumption of the three returns nothing over making none at all. An ablation shows the baseline is not capacity-limited, so that gap is attributable to inductive bias rather than model size. A secondary study trains the same baseline architecture on the dataset’s 561 hand-crafted features and reaches 0.9170 ± 0.0067, statistically indistinguishable from the convolutional model: the architectural prior is not the only route to this level of performance, but it is the one that needs no expert feature design. Across every model the dominant error is the sitting/standing boundary, which a waist-mounted sensor cannot resolve because both postures present a near-identical gravity vector.</w:t>
       </w:r>
     </w:p>
     <w:p>
@@ -1812,7 +1812,7 @@
                 <w:sz w:val="16"/>
                 <w:szCs w:val="16"/>
               </w:rPr>
-              <w:t xml:space="preserve">[PENDING]</w:t>
+              <w:t xml:space="preserve">0.8921 ± 0.0103</w:t>
             </w:r>
           </w:p>
         </w:tc>
@@ -1841,7 +1841,7 @@
                 <w:sz w:val="16"/>
                 <w:szCs w:val="16"/>
               </w:rPr>
-              <w:t xml:space="preserve">[PENDING]</w:t>
+              <w:t xml:space="preserve">0.8915 ± 0.0111</w:t>
             </w:r>
           </w:p>
         </w:tc>
@@ -1870,7 +1870,7 @@
                 <w:sz w:val="16"/>
                 <w:szCs w:val="16"/>
               </w:rPr>
-              <w:t xml:space="preserve">[PENDING]</w:t>
+              <w:t xml:space="preserve">4.0</w:t>
             </w:r>
           </w:p>
         </w:tc>
@@ -1907,7 +1907,7 @@
     </w:tbl>
     <w:p>
       <w:pPr>
-        <w:spacing w:after="120" w:line="262"/>
+        <w:spacing w:after="110" w:line="262"/>
         <w:jc w:val="both"/>
       </w:pPr>
       <w:r>
@@ -1920,7 +1920,61 @@
           <w:sz w:val="20"/>
           <w:szCs w:val="20"/>
         </w:rPr>
-        <w:t xml:space="preserve">The convolutional model leads at 0.9211 ± 0.0065 against 0.8925 ± 0.0087 for the baseline, a separation of 2.9 percentage points. With standard deviations below 0.009 on both sides, the intervals do not overlap, so this is a real ordering rather than an artefact of a favourable seed. The result that single-run figures had left ambiguous at the interim stage is therefore settled.</w:t>
+        <w:t xml:space="preserve">The comparison resolves into two groups rather than three. The convolutional model leads at 0.9211 ± 0.0065. The fully connected baseline and the recurrent model sit together well below it, at 0.8925 ± 0.0087 and 0.8921 ± 0.0103, separated from the CNN by 0.0286 and 0.0290 respectively, which is between two and three standard deviations in both cases.</w:t>
+      </w:r>
+    </w:p>
+    <w:p>
+      <w:pPr>
+        <w:spacing w:after="110" w:line="262"/>
+        <w:jc w:val="both"/>
+      </w:pPr>
+      <w:r>
+        <w:rPr>
+          <w:rFonts w:ascii="Times New Roman" w:cs="Times New Roman" w:eastAsia="Times New Roman" w:hAnsi="Times New Roman"/>
+          <w:b w:val="false"/>
+          <w:bCs w:val="false"/>
+          <w:i w:val="false"/>
+          <w:iCs w:val="false"/>
+          <w:sz w:val="20"/>
+          <w:szCs w:val="20"/>
+        </w:rPr>
+        <w:t xml:space="preserve">The distance between the baseline and the recurrent model is 0.0004, four hundredths of a single standard deviation. They are not merely close; on this task and under this protocol they are indistinguishable. The two carry comparable parameter budgets, 329,606 and 306,054, but sit at opposite ends of the inductive-bias spectrum: one encodes no assumption whatever about the structure of the signal, the other encodes order sensitivity in both temporal directions. That they land on the same number is the central negative result of this study. Bidirectional recurrence, applied to this task, buys nothing.</w:t>
+      </w:r>
+    </w:p>
+    <w:p>
+      <w:pPr>
+        <w:spacing w:after="110" w:line="262"/>
+        <w:jc w:val="both"/>
+      </w:pPr>
+      <w:r>
+        <w:rPr>
+          <w:rFonts w:ascii="Times New Roman" w:cs="Times New Roman" w:eastAsia="Times New Roman" w:hAnsi="Times New Roman"/>
+          <w:b w:val="false"/>
+          <w:bCs w:val="false"/>
+          <w:i w:val="false"/>
+          <w:iCs w:val="false"/>
+          <w:sz w:val="20"/>
+          <w:szCs w:val="20"/>
+        </w:rPr>
+        <w:t xml:space="preserve">This is what Hammerla et al. [9] predict. Their conclusion is conditional: recurrent models outperform convolutional ones on activities that are short in duration but have a natural ordering, while for prolonged repetitive activities they recommend convolutional models. The six classes here are prolonged and repetitive, and a 2.56-second window of steady walking has no privileged beginning or end for a recurrent model to exploit. The order information a BiLSTM is built to capture is, for this data, largely absent.</w:t>
+      </w:r>
+    </w:p>
+    <w:p>
+      <w:pPr>
+        <w:spacing w:after="120" w:line="262"/>
+        <w:jc w:val="both"/>
+      </w:pPr>
+      <w:r>
+        <w:rPr>
+          <w:rFonts w:ascii="Times New Roman" w:cs="Times New Roman" w:eastAsia="Times New Roman" w:hAnsi="Times New Roman"/>
+          <w:b w:val="false"/>
+          <w:bCs w:val="false"/>
+          <w:i w:val="false"/>
+          <w:iCs w:val="false"/>
+          <w:sz w:val="20"/>
+          <w:szCs w:val="20"/>
+        </w:rPr>
+        <w:t xml:space="preserve">The interim report, working from single runs, recorded the BiLSTM at 0.8890 against the baseline’s 0.8996 and tentatively described the recurrent model as underperforming the architecture-free control. Five seeds do not support that reading. The correct statement is the simpler one: the two are equal, and the gap seen in single runs was seed variation.</w:t>
       </w:r>
     </w:p>
     <w:p>
@@ -2666,7 +2720,7 @@
                 <w:sz w:val="16"/>
                 <w:szCs w:val="16"/>
               </w:rPr>
-              <w:t xml:space="preserve">[PENDING]</w:t>
+              <w:t xml:space="preserve">0.924 ± 0.027</w:t>
             </w:r>
           </w:p>
         </w:tc>
@@ -2695,7 +2749,7 @@
                 <w:sz w:val="16"/>
                 <w:szCs w:val="16"/>
               </w:rPr>
-              <w:t xml:space="preserve">[PENDING]</w:t>
+              <w:t xml:space="preserve">0.897 ± 0.031</w:t>
             </w:r>
           </w:p>
         </w:tc>
@@ -2724,7 +2778,7 @@
                 <w:sz w:val="16"/>
                 <w:szCs w:val="16"/>
               </w:rPr>
-              <w:t xml:space="preserve">[PENDING]</w:t>
+              <w:t xml:space="preserve">0.881 ± 0.014</w:t>
             </w:r>
           </w:p>
         </w:tc>
@@ -2753,7 +2807,7 @@
                 <w:sz w:val="16"/>
                 <w:szCs w:val="16"/>
               </w:rPr>
-              <w:t xml:space="preserve">[PENDING]</w:t>
+              <w:t xml:space="preserve">0.821 ± 0.015</w:t>
             </w:r>
           </w:p>
         </w:tc>
@@ -2782,7 +2836,7 @@
                 <w:sz w:val="16"/>
                 <w:szCs w:val="16"/>
               </w:rPr>
-              <w:t xml:space="preserve">[PENDING]</w:t>
+              <w:t xml:space="preserve">0.851 ± 0.007</w:t>
             </w:r>
           </w:p>
         </w:tc>
@@ -2811,7 +2865,7 @@
                 <w:sz w:val="16"/>
                 <w:szCs w:val="16"/>
               </w:rPr>
-              <w:t xml:space="preserve">[PENDING]</w:t>
+              <w:t xml:space="preserve">0.975 ± 0.001</w:t>
             </w:r>
           </w:p>
         </w:tc>
@@ -7967,7 +8021,7 @@
                 <w:sz w:val="16"/>
                 <w:szCs w:val="16"/>
               </w:rPr>
-              <w:t xml:space="preserve">BiLSTM</w:t>
+              <w:t xml:space="preserve">BiLSTM (hidden 96)</w:t>
             </w:r>
           </w:p>
         </w:tc>
@@ -7996,7 +8050,7 @@
                 <w:sz w:val="16"/>
                 <w:szCs w:val="16"/>
               </w:rPr>
-              <w:t xml:space="preserve">[PENDING]</w:t>
+              <w:t xml:space="preserve">0.178 ± 0.024</w:t>
             </w:r>
           </w:p>
         </w:tc>
@@ -8025,7 +8079,7 @@
                 <w:sz w:val="16"/>
                 <w:szCs w:val="16"/>
               </w:rPr>
-              <w:t xml:space="preserve">[PENDING]</w:t>
+              <w:t xml:space="preserve">0.123 ± 0.024</w:t>
             </w:r>
           </w:p>
         </w:tc>
@@ -8054,7 +8108,7 @@
                 <w:sz w:val="16"/>
                 <w:szCs w:val="16"/>
               </w:rPr>
-              <w:t xml:space="preserve">[PENDING]</w:t>
+              <w:t xml:space="preserve">5 seeds, fixed split</w:t>
             </w:r>
           </w:p>
         </w:tc>
@@ -8213,12 +8267,30 @@
           <w:rFonts w:ascii="Times New Roman" w:cs="Times New Roman" w:eastAsia="Times New Roman" w:hAnsi="Times New Roman"/>
           <w:b w:val="false"/>
           <w:bCs w:val="false"/>
-          <w:i/>
-          <w:iCs/>
+          <w:i w:val="false"/>
+          <w:iCs w:val="false"/>
           <w:sz w:val="20"/>
           <w:szCs w:val="20"/>
         </w:rPr>
-        <w:t xml:space="preserve">[The recurrent model’s position in this ordering is to be stated once its multi-seed run is complete. The prediction from Hammerla et al. [9] is that it will not outperform the convolutional model on prolonged repetitive locomotion, and the single-seed result of 0.8890 was consistent with that; it requires multi-seed confirmation before being reported as a finding.]</w:t>
+        <w:t xml:space="preserve">The recurrent model is the clearest negative result. At 0.8921 ± 0.0103 it is indistinguishable from the architecture-free baseline’s 0.8925 ± 0.0087, a difference of 0.0004 on comparable parameter budgets. Bidirectional recurrence, the strongest structural assumption of the three, returns nothing over making no assumption at all. This confirms the conditional stated by Hammerla et al. [9]: recurrence pays on short gestures with a natural ordering, not on prolonged repetitive locomotion, which is what these six classes are.</w:t>
+      </w:r>
+    </w:p>
+    <w:p>
+      <w:pPr>
+        <w:spacing w:after="110" w:line="262"/>
+        <w:jc w:val="both"/>
+      </w:pPr>
+      <w:r>
+        <w:rPr>
+          <w:rFonts w:ascii="Times New Roman" w:cs="Times New Roman" w:eastAsia="Times New Roman" w:hAnsi="Times New Roman"/>
+          <w:b w:val="false"/>
+          <w:bCs w:val="false"/>
+          <w:i w:val="false"/>
+          <w:iCs w:val="false"/>
+          <w:sz w:val="20"/>
+          <w:szCs w:val="20"/>
+        </w:rPr>
+        <w:t xml:space="preserve">Taken together the three results say something more precise than that architecture matters. Architecture matters when its assumption matches the data. Locality and translation invariance match a repeating gait cycle and are worth 0.0286. Order sensitivity across a window of steady walking matches nothing in particular and is worth 0.0004.</w:t>
       </w:r>
     </w:p>
     <w:p>

</xml_diff>